<commit_message>
feat: add lecture notebook covering statistical inference and normality tests
</commit_message>
<xml_diff>
--- a/Informática Aplicada a Aeronáutica/Exercicios/Texto_Exercicio_Historia_da_Aviacao.docx
+++ b/Informática Aplicada a Aeronáutica/Exercicios/Texto_Exercicio_Historia_da_Aviacao.docx
@@ -3,57 +3,275 @@
 <w:document xmlns:wpc="http://schemas.microsoft.com/office/word/2010/wordprocessingCanvas" xmlns:cx="http://schemas.microsoft.com/office/drawing/2014/chartex" xmlns:cx1="http://schemas.microsoft.com/office/drawing/2015/9/8/chartex" xmlns:cx2="http://schemas.microsoft.com/office/drawing/2015/10/21/chartex" xmlns:cx3="http://schemas.microsoft.com/office/drawing/2016/5/9/chartex" xmlns:cx4="http://schemas.microsoft.com/office/drawing/2016/5/10/chartex" xmlns:cx5="http://schemas.microsoft.com/office/drawing/2016/5/11/chartex" xmlns:cx6="http://schemas.microsoft.com/office/drawing/2016/5/12/chartex" xmlns:cx7="http://schemas.microsoft.com/office/drawing/2016/5/13/chartex" xmlns:cx8="http://schemas.microsoft.com/office/drawing/2016/5/14/chartex" xmlns:mc="http://schemas.openxmlformats.org/markup-compatibility/2006" xmlns:aink="http://schemas.microsoft.com/office/drawing/2016/ink" xmlns:am3d="http://schemas.microsoft.com/office/drawing/2017/model3d" xmlns:o="urn:schemas-microsoft-com:office:office" xmlns:oel="http://schemas.microsoft.com/office/2019/extlst" xmlns:r="http://schemas.openxmlformats.org/officeDocument/2006/relationships" xmlns:m="http://schemas.openxmlformats.org/officeDocument/2006/math" xmlns:v="urn:schemas-microsoft-com:vml" xmlns:wp14="http://schemas.microsoft.com/office/word/2010/wordprocessingDrawing" xmlns:wp="http://schemas.openxmlformats.org/drawingml/2006/wordprocessingDrawing" xmlns:w10="urn:schemas-microsoft-com:office:word" xmlns:w="http://schemas.openxmlformats.org/wordprocessingml/2006/main" xmlns:w14="http://schemas.microsoft.com/office/word/2010/wordml" xmlns:w15="http://schemas.microsoft.com/office/word/2012/wordml" xmlns:w16cex="http://schemas.microsoft.com/office/word/2018/wordml/cex" xmlns:w16cid="http://schemas.microsoft.com/office/word/2016/wordml/cid" xmlns:w16="http://schemas.microsoft.com/office/word/2018/wordml" xmlns:w16du="http://schemas.microsoft.com/office/word/2023/wordml/word16du" xmlns:w16sdtdh="http://schemas.microsoft.com/office/word/2020/wordml/sdtdatahash" xmlns:w16sdtfl="http://schemas.microsoft.com/office/word/2024/wordml/sdtformatlock" xmlns:w16se="http://schemas.microsoft.com/office/word/2015/wordml/symex" xmlns:wpg="http://schemas.microsoft.com/office/word/2010/wordprocessingGroup" xmlns:wpi="http://schemas.microsoft.com/office/word/2010/wordprocessingInk" xmlns:wne="http://schemas.microsoft.com/office/word/2006/wordml" xmlns:wps="http://schemas.microsoft.com/office/word/2010/wordprocessingShape" mc:Ignorable="w14 w15 w16se w16cid w16 w16cex w16sdtdh w16sdtfl w16du wp14">
   <w:body>
     <w:p>
-      <w:r>
-        <w:t>FATEC SOROCABA — CURSO SUPERIOR DE TECNOLOGIA EM MANUTENÇÃO DE AERONAVES</w:t>
-      </w:r>
-    </w:p>
-    <w:p>
-      <w:r>
-        <w:t>COMPONENTE CURRICULAR: INF-117 — INFORMÁTICA APLICADA A AERONÁUTICA</w:t>
-      </w:r>
-    </w:p>
-    <w:p/>
-    <w:p>
+      <w:pPr>
+        <w:spacing w:after="0"/>
+        <w:ind w:firstLine="0"/>
+        <w:jc w:val="center"/>
+        <w:rPr>
+          <w:b/>
+          <w:bCs/>
+        </w:rPr>
+      </w:pPr>
+      <w:r>
+        <w:rPr>
+          <w:b/>
+          <w:bCs/>
+        </w:rPr>
+        <w:t>FATEC SOROCAB</w:t>
+      </w:r>
+      <w:r>
+        <w:rPr>
+          <w:b/>
+          <w:bCs/>
+        </w:rPr>
+        <w:t>A</w:t>
+      </w:r>
+    </w:p>
+    <w:p>
+      <w:pPr>
+        <w:spacing w:after="0"/>
+        <w:ind w:firstLine="0"/>
+        <w:jc w:val="center"/>
+        <w:rPr>
+          <w:b/>
+          <w:bCs/>
+        </w:rPr>
+      </w:pPr>
+      <w:r>
+        <w:rPr>
+          <w:b/>
+          <w:bCs/>
+        </w:rPr>
+        <w:t>CURSO SUPERIOR DE TECNOLOGIA EM MANUTENÇÃO DE AERONAVES</w:t>
+      </w:r>
+    </w:p>
+    <w:p>
+      <w:pPr>
+        <w:spacing w:after="0"/>
+        <w:ind w:firstLine="0"/>
+        <w:jc w:val="center"/>
+      </w:pPr>
+    </w:p>
+    <w:p>
+      <w:pPr>
+        <w:spacing w:after="0"/>
+        <w:ind w:firstLine="0"/>
+        <w:jc w:val="center"/>
+      </w:pPr>
+    </w:p>
+    <w:p>
+      <w:pPr>
+        <w:spacing w:after="0"/>
+        <w:ind w:firstLine="0"/>
+        <w:jc w:val="center"/>
+      </w:pPr>
+      <w:r>
+        <w:t>ANDRÉ SOUZA</w:t>
+      </w:r>
+    </w:p>
+    <w:p>
+      <w:pPr>
+        <w:spacing w:after="0"/>
+        <w:ind w:firstLine="0"/>
+        <w:jc w:val="center"/>
+      </w:pPr>
+    </w:p>
+    <w:p>
+      <w:pPr>
+        <w:spacing w:after="0"/>
+        <w:ind w:firstLine="0"/>
+        <w:jc w:val="center"/>
+      </w:pPr>
+    </w:p>
+    <w:p>
+      <w:pPr>
+        <w:spacing w:after="0"/>
+        <w:ind w:firstLine="0"/>
+        <w:jc w:val="center"/>
+      </w:pPr>
+    </w:p>
+    <w:p>
+      <w:pPr>
+        <w:spacing w:after="0"/>
+        <w:ind w:firstLine="0"/>
+        <w:jc w:val="center"/>
+      </w:pPr>
+    </w:p>
+    <w:p>
+      <w:pPr>
+        <w:spacing w:after="0"/>
+        <w:ind w:firstLine="0"/>
+        <w:jc w:val="center"/>
+      </w:pPr>
+    </w:p>
+    <w:p>
+      <w:pPr>
+        <w:spacing w:after="0"/>
+        <w:ind w:firstLine="0"/>
+        <w:jc w:val="center"/>
+      </w:pPr>
+    </w:p>
+    <w:p>
+      <w:pPr>
+        <w:spacing w:after="0"/>
+        <w:ind w:firstLine="0"/>
+        <w:jc w:val="center"/>
+      </w:pPr>
+    </w:p>
+    <w:p>
+      <w:pPr>
+        <w:spacing w:after="0"/>
+        <w:ind w:firstLine="0"/>
+        <w:jc w:val="center"/>
+      </w:pPr>
+    </w:p>
+    <w:p>
+      <w:pPr>
+        <w:spacing w:after="0"/>
+        <w:ind w:firstLine="0"/>
+        <w:jc w:val="center"/>
+      </w:pPr>
+    </w:p>
+    <w:p>
+      <w:pPr>
+        <w:spacing w:after="0"/>
+        <w:ind w:firstLine="0"/>
+        <w:jc w:val="center"/>
+      </w:pPr>
+    </w:p>
+    <w:p>
+      <w:pPr>
+        <w:spacing w:after="0"/>
+        <w:ind w:firstLine="0"/>
+        <w:jc w:val="center"/>
+      </w:pPr>
+    </w:p>
+    <w:p>
+      <w:pPr>
+        <w:spacing w:after="0"/>
+        <w:ind w:firstLine="0"/>
+        <w:jc w:val="center"/>
+      </w:pPr>
       <w:r>
         <w:t>RELATÓRIO TÉCNICO: INTRODUÇÃO À AVIAÇÃO CIVIL, HISTÓRIA E REGULAMENTAÇÃO AERONÁUTICA</w:t>
       </w:r>
     </w:p>
-    <w:p/>
-    <w:p>
-      <w:r>
-        <w:t>AUTOR: [DIGITE SEU NOME COMPLETO AQUI]</w:t>
-      </w:r>
-    </w:p>
-    <w:p>
-      <w:r>
-        <w:t>PROFESSOR: ANDRÉ SOUZA</w:t>
-      </w:r>
-    </w:p>
-    <w:p>
-      <w:r>
-        <w:t>DATA: 14 DE AGOSTO DE 2026</w:t>
-      </w:r>
-    </w:p>
-    <w:p>
-      <w:r>
-        <w:t>SOROCABA - SP</w:t>
-      </w:r>
-    </w:p>
-    <w:p/>
-    <w:p>
-      <w:pPr>
-        <w:rPr>
-          <w:rFonts w:asciiTheme="majorHAnsi" w:eastAsiaTheme="majorEastAsia" w:hAnsiTheme="majorHAnsi" w:cstheme="majorBidi"/>
-          <w:color w:val="0F4761" w:themeColor="accent1" w:themeShade="BF"/>
-          <w:kern w:val="0"/>
-          <w:sz w:val="32"/>
-          <w:szCs w:val="32"/>
-          <w:lang w:eastAsia="pt-BR"/>
-          <w14:ligatures w14:val="none"/>
-        </w:rPr>
-      </w:pPr>
-      <w:r>
-        <w:br w:type="page"/>
+    <w:p>
+      <w:pPr>
+        <w:spacing w:after="0"/>
+        <w:ind w:firstLine="0"/>
+        <w:jc w:val="center"/>
+      </w:pPr>
+    </w:p>
+    <w:p>
+      <w:pPr>
+        <w:spacing w:after="0"/>
+        <w:ind w:firstLine="0"/>
+        <w:jc w:val="center"/>
+      </w:pPr>
+    </w:p>
+    <w:p>
+      <w:pPr>
+        <w:spacing w:after="0"/>
+        <w:ind w:firstLine="0"/>
+        <w:jc w:val="center"/>
+      </w:pPr>
+    </w:p>
+    <w:p>
+      <w:pPr>
+        <w:spacing w:after="0"/>
+        <w:ind w:firstLine="0"/>
+        <w:jc w:val="center"/>
+      </w:pPr>
+    </w:p>
+    <w:p>
+      <w:pPr>
+        <w:spacing w:after="0"/>
+        <w:ind w:firstLine="0"/>
+        <w:jc w:val="center"/>
+      </w:pPr>
+    </w:p>
+    <w:p>
+      <w:pPr>
+        <w:spacing w:after="0"/>
+        <w:ind w:firstLine="0"/>
+        <w:jc w:val="center"/>
+      </w:pPr>
+    </w:p>
+    <w:p>
+      <w:pPr>
+        <w:spacing w:after="0"/>
+        <w:ind w:firstLine="0"/>
+        <w:jc w:val="center"/>
+      </w:pPr>
+    </w:p>
+    <w:p>
+      <w:pPr>
+        <w:spacing w:after="0"/>
+        <w:ind w:firstLine="0"/>
+        <w:jc w:val="center"/>
+      </w:pPr>
+    </w:p>
+    <w:p>
+      <w:pPr>
+        <w:spacing w:after="0"/>
+        <w:ind w:firstLine="0"/>
+        <w:jc w:val="center"/>
+      </w:pPr>
+    </w:p>
+    <w:p>
+      <w:pPr>
+        <w:spacing w:after="0"/>
+        <w:ind w:firstLine="0"/>
+        <w:jc w:val="center"/>
+      </w:pPr>
+    </w:p>
+    <w:p>
+      <w:pPr>
+        <w:spacing w:after="0"/>
+        <w:ind w:firstLine="0"/>
+        <w:jc w:val="center"/>
+      </w:pPr>
+    </w:p>
+    <w:p>
+      <w:pPr>
+        <w:spacing w:after="0"/>
+        <w:ind w:firstLine="0"/>
+        <w:jc w:val="center"/>
+      </w:pPr>
+    </w:p>
+    <w:p>
+      <w:pPr>
+        <w:spacing w:after="0"/>
+        <w:ind w:firstLine="0"/>
+        <w:jc w:val="center"/>
+      </w:pPr>
+    </w:p>
+    <w:p>
+      <w:pPr>
+        <w:spacing w:after="0"/>
+        <w:ind w:firstLine="0"/>
+        <w:jc w:val="center"/>
+      </w:pPr>
+    </w:p>
+    <w:p>
+      <w:pPr>
+        <w:spacing w:after="0"/>
+        <w:ind w:firstLine="0"/>
+        <w:jc w:val="center"/>
+      </w:pPr>
+      <w:r>
+        <w:t>SOROCABA</w:t>
+      </w:r>
+    </w:p>
+    <w:p>
+      <w:pPr>
+        <w:spacing w:after="0"/>
+        <w:ind w:firstLine="0"/>
+        <w:jc w:val="center"/>
+      </w:pPr>
+      <w:r>
+        <w:t>2026</w:t>
       </w:r>
     </w:p>
     <w:sdt>
@@ -129,7 +347,7 @@
           <w:r>
             <w:fldChar w:fldCharType="separate"/>
           </w:r>
-          <w:hyperlink w:anchor="_Toc238193053" w:history="1">
+          <w:hyperlink w:anchor="_Toc238763186" w:history="1">
             <w:r>
               <w:rPr>
                 <w:rStyle w:val="Hyperlink"/>
@@ -156,7 +374,7 @@
                 <w:noProof/>
                 <w:webHidden/>
               </w:rPr>
-              <w:instrText xml:space="preserve"> PAGEREF _Toc238193053 \h </w:instrText>
+              <w:instrText xml:space="preserve"> PAGEREF _Toc238763186 \h </w:instrText>
             </w:r>
             <w:r>
               <w:rPr>
@@ -176,7 +394,7 @@
                 <w:noProof/>
                 <w:webHidden/>
               </w:rPr>
-              <w:t>3</w:t>
+              <w:t>2</w:t>
             </w:r>
             <w:r>
               <w:rPr>
@@ -199,7 +417,7 @@
               <w:lang w:eastAsia="pt-BR"/>
             </w:rPr>
           </w:pPr>
-          <w:hyperlink w:anchor="_Toc238193054" w:history="1">
+          <w:hyperlink w:anchor="_Toc238763187" w:history="1">
             <w:r>
               <w:rPr>
                 <w:rStyle w:val="Hyperlink"/>
@@ -226,7 +444,7 @@
                 <w:noProof/>
                 <w:webHidden/>
               </w:rPr>
-              <w:instrText xml:space="preserve"> PAGEREF _Toc238193054 \h </w:instrText>
+              <w:instrText xml:space="preserve"> PAGEREF _Toc238763187 \h </w:instrText>
             </w:r>
             <w:r>
               <w:rPr>
@@ -246,7 +464,7 @@
                 <w:noProof/>
                 <w:webHidden/>
               </w:rPr>
-              <w:t>5</w:t>
+              <w:t>4</w:t>
             </w:r>
             <w:r>
               <w:rPr>
@@ -269,7 +487,7 @@
               <w:lang w:eastAsia="pt-BR"/>
             </w:rPr>
           </w:pPr>
-          <w:hyperlink w:anchor="_Toc238193055" w:history="1">
+          <w:hyperlink w:anchor="_Toc238763188" w:history="1">
             <w:r>
               <w:rPr>
                 <w:rStyle w:val="Hyperlink"/>
@@ -296,7 +514,7 @@
                 <w:noProof/>
                 <w:webHidden/>
               </w:rPr>
-              <w:instrText xml:space="preserve"> PAGEREF _Toc238193055 \h </w:instrText>
+              <w:instrText xml:space="preserve"> PAGEREF _Toc238763188 \h </w:instrText>
             </w:r>
             <w:r>
               <w:rPr>
@@ -316,7 +534,7 @@
                 <w:noProof/>
                 <w:webHidden/>
               </w:rPr>
-              <w:t>6</w:t>
+              <w:t>5</w:t>
             </w:r>
             <w:r>
               <w:rPr>
@@ -339,7 +557,7 @@
               <w:lang w:eastAsia="pt-BR"/>
             </w:rPr>
           </w:pPr>
-          <w:hyperlink w:anchor="_Toc238193056" w:history="1">
+          <w:hyperlink w:anchor="_Toc238763189" w:history="1">
             <w:r>
               <w:rPr>
                 <w:rStyle w:val="Hyperlink"/>
@@ -366,7 +584,7 @@
                 <w:noProof/>
                 <w:webHidden/>
               </w:rPr>
-              <w:instrText xml:space="preserve"> PAGEREF _Toc238193056 \h </w:instrText>
+              <w:instrText xml:space="preserve"> PAGEREF _Toc238763189 \h </w:instrText>
             </w:r>
             <w:r>
               <w:rPr>
@@ -386,7 +604,7 @@
                 <w:noProof/>
                 <w:webHidden/>
               </w:rPr>
-              <w:t>6</w:t>
+              <w:t>5</w:t>
             </w:r>
             <w:r>
               <w:rPr>
@@ -409,7 +627,7 @@
               <w:lang w:eastAsia="pt-BR"/>
             </w:rPr>
           </w:pPr>
-          <w:hyperlink w:anchor="_Toc238193057" w:history="1">
+          <w:hyperlink w:anchor="_Toc238763190" w:history="1">
             <w:r>
               <w:rPr>
                 <w:rStyle w:val="Hyperlink"/>
@@ -436,7 +654,7 @@
                 <w:noProof/>
                 <w:webHidden/>
               </w:rPr>
-              <w:instrText xml:space="preserve"> PAGEREF _Toc238193057 \h </w:instrText>
+              <w:instrText xml:space="preserve"> PAGEREF _Toc238763190 \h </w:instrText>
             </w:r>
             <w:r>
               <w:rPr>
@@ -456,7 +674,7 @@
                 <w:noProof/>
                 <w:webHidden/>
               </w:rPr>
-              <w:t>7</w:t>
+              <w:t>6</w:t>
             </w:r>
             <w:r>
               <w:rPr>
@@ -479,7 +697,7 @@
               <w:lang w:eastAsia="pt-BR"/>
             </w:rPr>
           </w:pPr>
-          <w:hyperlink w:anchor="_Toc238193058" w:history="1">
+          <w:hyperlink w:anchor="_Toc238763191" w:history="1">
             <w:r>
               <w:rPr>
                 <w:rStyle w:val="Hyperlink"/>
@@ -506,7 +724,7 @@
                 <w:noProof/>
                 <w:webHidden/>
               </w:rPr>
-              <w:instrText xml:space="preserve"> PAGEREF _Toc238193058 \h </w:instrText>
+              <w:instrText xml:space="preserve"> PAGEREF _Toc238763191 \h </w:instrText>
             </w:r>
             <w:r>
               <w:rPr>
@@ -526,7 +744,7 @@
                 <w:noProof/>
                 <w:webHidden/>
               </w:rPr>
-              <w:t>9</w:t>
+              <w:t>8</w:t>
             </w:r>
             <w:r>
               <w:rPr>
@@ -549,7 +767,7 @@
               <w:lang w:eastAsia="pt-BR"/>
             </w:rPr>
           </w:pPr>
-          <w:hyperlink w:anchor="_Toc238193059" w:history="1">
+          <w:hyperlink w:anchor="_Toc238763192" w:history="1">
             <w:r>
               <w:rPr>
                 <w:rStyle w:val="Hyperlink"/>
@@ -576,7 +794,7 @@
                 <w:noProof/>
                 <w:webHidden/>
               </w:rPr>
-              <w:instrText xml:space="preserve"> PAGEREF _Toc238193059 \h </w:instrText>
+              <w:instrText xml:space="preserve"> PAGEREF _Toc238763192 \h </w:instrText>
             </w:r>
             <w:r>
               <w:rPr>
@@ -596,7 +814,7 @@
                 <w:noProof/>
                 <w:webHidden/>
               </w:rPr>
-              <w:t>10</w:t>
+              <w:t>9</w:t>
             </w:r>
             <w:r>
               <w:rPr>
@@ -619,7 +837,7 @@
               <w:lang w:eastAsia="pt-BR"/>
             </w:rPr>
           </w:pPr>
-          <w:hyperlink w:anchor="_Toc238193060" w:history="1">
+          <w:hyperlink w:anchor="_Toc238763193" w:history="1">
             <w:r>
               <w:rPr>
                 <w:rStyle w:val="Hyperlink"/>
@@ -646,7 +864,7 @@
                 <w:noProof/>
                 <w:webHidden/>
               </w:rPr>
-              <w:instrText xml:space="preserve"> PAGEREF _Toc238193060 \h </w:instrText>
+              <w:instrText xml:space="preserve"> PAGEREF _Toc238763193 \h </w:instrText>
             </w:r>
             <w:r>
               <w:rPr>
@@ -666,7 +884,7 @@
                 <w:noProof/>
                 <w:webHidden/>
               </w:rPr>
-              <w:t>11</w:t>
+              <w:t>10</w:t>
             </w:r>
             <w:r>
               <w:rPr>
@@ -689,7 +907,7 @@
               <w:lang w:eastAsia="pt-BR"/>
             </w:rPr>
           </w:pPr>
-          <w:hyperlink w:anchor="_Toc238193061" w:history="1">
+          <w:hyperlink w:anchor="_Toc238763194" w:history="1">
             <w:r>
               <w:rPr>
                 <w:rStyle w:val="Hyperlink"/>
@@ -716,7 +934,7 @@
                 <w:noProof/>
                 <w:webHidden/>
               </w:rPr>
-              <w:instrText xml:space="preserve"> PAGEREF _Toc238193061 \h </w:instrText>
+              <w:instrText xml:space="preserve"> PAGEREF _Toc238763194 \h </w:instrText>
             </w:r>
             <w:r>
               <w:rPr>
@@ -736,7 +954,7 @@
                 <w:noProof/>
                 <w:webHidden/>
               </w:rPr>
-              <w:t>12</w:t>
+              <w:t>11</w:t>
             </w:r>
             <w:r>
               <w:rPr>
@@ -764,6 +982,7 @@
       <w:pPr>
         <w:pStyle w:val="Ttulo1"/>
         <w:sectPr>
+          <w:headerReference w:type="default" r:id="rId7"/>
           <w:pgSz w:w="11906" w:h="16838"/>
           <w:pgMar w:top="1701" w:right="1134" w:bottom="1134" w:left="1701" w:header="709" w:footer="709" w:gutter="0"/>
           <w:cols w:space="708"/>
@@ -775,7 +994,7 @@
       <w:pPr>
         <w:pStyle w:val="Ttulo1"/>
       </w:pPr>
-      <w:bookmarkStart w:id="0" w:name="_Toc238193053"/>
+      <w:bookmarkStart w:id="0" w:name="_Toc238763186"/>
       <w:r>
         <w:lastRenderedPageBreak/>
         <w:t>1. HISTÓRIA E EVOLUÇÃO DA AVIAÇÃO</w:t>
@@ -881,6 +1100,62 @@
       <w:proofErr w:type="spellEnd"/>
       <w:r>
         <w:t>.</w:t>
+      </w:r>
+    </w:p>
+    <w:p/>
+    <w:p>
+      <w:pPr>
+        <w:pStyle w:val="Ttulo1"/>
+        <w:sectPr>
+          <w:headerReference w:type="default" r:id="rId8"/>
+          <w:pgSz w:w="11906" w:h="16838"/>
+          <w:pgMar w:top="1701" w:right="1134" w:bottom="1134" w:left="1701" w:header="709" w:footer="709" w:gutter="0"/>
+          <w:pgNumType w:start="2"/>
+          <w:cols w:space="708"/>
+          <w:docGrid w:linePitch="360"/>
+        </w:sectPr>
+      </w:pPr>
+    </w:p>
+    <w:p>
+      <w:pPr>
+        <w:pStyle w:val="Ttulo1"/>
+      </w:pPr>
+      <w:bookmarkStart w:id="1" w:name="_Toc238763187"/>
+      <w:r>
+        <w:lastRenderedPageBreak/>
+        <w:t>2. HISTÓRIA DA AVIAÇÃO CIVIL BRASILEIRA E A ANAC</w:t>
+      </w:r>
+      <w:bookmarkEnd w:id="1"/>
+    </w:p>
+    <w:p>
+      <w:r>
+        <w:t>A regulação da aviação civil no Brasil passou por profundas transformações institucionais. Inicialmente gerenciada pelo Departamento de Aviação Civil (DAC), órgão militar criado em 1938 e subordinado ao antigo Ministério da Aeronáutica, a aviação civil brasileira necessitava de uma transição para um modelo regulatório moderno e alinhado aos padrões internacionais de agências autônomas.</w:t>
+      </w:r>
+    </w:p>
+    <w:p>
+      <w:r>
+        <w:t>A Agência Nacional de Aviação Civil (ANAC) foi instituída pela Lei nº 11.182, de 27 de setembro de 2005, e iniciou suas atividades operacionais em 2006. Vinculada ao Ministério de Portos e Aeroportos, a ANAC é uma autarquia federal de regime especial dotada de independência administrativa, autonomia financeira, patrimônio próprio e autoridade técnica para regular e fiscalizar a aviação civil, a infraestrutura aeronáutica e os serviços aeroportuários no Brasil.</w:t>
+      </w:r>
+    </w:p>
+    <w:p>
+      <w:r>
+        <w:t>De acordo com seu marco legalizador, as ações da ANAC enquadram-se em quatro macroprocessos estratégicos: normatização, certificação, fiscalização continuada e representação institucional internacional. A missão institucional da Agência é promover a segurança operacional (</w:t>
+      </w:r>
+      <w:proofErr w:type="spellStart"/>
+      <w:r>
+        <w:t>safety</w:t>
+      </w:r>
+      <w:proofErr w:type="spellEnd"/>
+      <w:r>
+        <w:t>), a proteção contra atos de interferência ilícita (</w:t>
+      </w:r>
+      <w:proofErr w:type="spellStart"/>
+      <w:r>
+        <w:t>security</w:t>
+      </w:r>
+      <w:proofErr w:type="spellEnd"/>
+      <w:r>
+        <w:t>), a eficiência dos serviços e o desenvolvimento sustentável do setor aéreo brasileiro.</w:t>
       </w:r>
     </w:p>
     <w:p/>
@@ -899,45 +1174,101 @@
       <w:pPr>
         <w:pStyle w:val="Ttulo1"/>
       </w:pPr>
-      <w:bookmarkStart w:id="1" w:name="_Toc238193054"/>
+      <w:bookmarkStart w:id="2" w:name="_Toc238763188"/>
       <w:r>
         <w:lastRenderedPageBreak/>
-        <w:t>2. HISTÓRIA DA AVIAÇÃO CIVIL BRASILEIRA E A ANAC</w:t>
-      </w:r>
-      <w:bookmarkEnd w:id="1"/>
-    </w:p>
-    <w:p>
-      <w:r>
-        <w:t>A regulação da aviação civil no Brasil passou por profundas transformações institucionais. Inicialmente gerenciada pelo Departamento de Aviação Civil (DAC), órgão militar criado em 1938 e subordinado ao antigo Ministério da Aeronáutica, a aviação civil brasileira necessitava de uma transição para um modelo regulatório moderno e alinhado aos padrões internacionais de agências autônomas.</w:t>
-      </w:r>
-    </w:p>
-    <w:p>
-      <w:r>
-        <w:t>A Agência Nacional de Aviação Civil (ANAC) foi instituída pela Lei nº 11.182, de 27 de setembro de 2005, e iniciou suas atividades operacionais em 2006. Vinculada ao Ministério de Portos e Aeroportos, a ANAC é uma autarquia federal de regime especial dotada de independência administrativa, autonomia financeira, patrimônio próprio e autoridade técnica para regular e fiscalizar a aviação civil, a infraestrutura aeronáutica e os serviços aeroportuários no Brasil.</w:t>
-      </w:r>
-    </w:p>
-    <w:p>
-      <w:r>
-        <w:t>De acordo com seu marco legalizador, as ações da ANAC enquadram-se em quatro macroprocessos estratégicos: normatização, certificação, fiscalização continuada e representação institucional internacional. A missão institucional da Agência é promover a segurança operacional (</w:t>
+        <w:t>3. ATUAÇÃO E COMPETÊNCIAS REGULATÓRIAS DA ANAC</w:t>
+      </w:r>
+      <w:bookmarkEnd w:id="2"/>
+    </w:p>
+    <w:p>
+      <w:r>
+        <w:t xml:space="preserve">A ANAC exerce o papel de autoridade de aviação civil do Estado brasileiro, atuando em conformidade com a Convenção sobre Aviação Civil Internacional (Convenção de Chicago de 1944), da qual o Brasil é membro fundador e signatário. A Agência possui acordos bilaterais de cooperação técnica e reconhecimento mútuo com as principais autoridades aeronáuticas mundiais, como a Federal </w:t>
       </w:r>
       <w:proofErr w:type="spellStart"/>
       <w:r>
-        <w:t>safety</w:t>
+        <w:t>Aviation</w:t>
       </w:r>
       <w:proofErr w:type="spellEnd"/>
       <w:r>
-        <w:t>), a proteção contra atos de interferência ilícita (</w:t>
+        <w:t xml:space="preserve"> </w:t>
       </w:r>
       <w:proofErr w:type="spellStart"/>
       <w:r>
-        <w:t>security</w:t>
+        <w:t>Administration</w:t>
       </w:r>
       <w:proofErr w:type="spellEnd"/>
       <w:r>
-        <w:t>), a eficiência dos serviços e o desenvolvimento sustentável do setor aéreo brasileiro.</w:t>
-      </w:r>
-    </w:p>
-    <w:p/>
+        <w:t xml:space="preserve"> (FAA) dos Estados Unidos e a </w:t>
+      </w:r>
+      <w:proofErr w:type="spellStart"/>
+      <w:r>
+        <w:t>European</w:t>
+      </w:r>
+      <w:proofErr w:type="spellEnd"/>
+      <w:r>
+        <w:t xml:space="preserve"> Union </w:t>
+      </w:r>
+      <w:proofErr w:type="spellStart"/>
+      <w:r>
+        <w:t>Aviation</w:t>
+      </w:r>
+      <w:proofErr w:type="spellEnd"/>
+      <w:r>
+        <w:t xml:space="preserve"> </w:t>
+      </w:r>
+      <w:proofErr w:type="spellStart"/>
+      <w:r>
+        <w:t>Safety</w:t>
+      </w:r>
+      <w:proofErr w:type="spellEnd"/>
+      <w:r>
+        <w:t xml:space="preserve"> </w:t>
+      </w:r>
+      <w:proofErr w:type="spellStart"/>
+      <w:r>
+        <w:t>Agency</w:t>
+      </w:r>
+      <w:proofErr w:type="spellEnd"/>
+      <w:r>
+        <w:t xml:space="preserve"> (EASA) da União Europeia.</w:t>
+      </w:r>
+    </w:p>
+    <w:p>
+      <w:pPr>
+        <w:pStyle w:val="Ttulo2"/>
+      </w:pPr>
+      <w:bookmarkStart w:id="3" w:name="_Toc238763189"/>
+      <w:r>
+        <w:t>3.1. Principais atribuições</w:t>
+      </w:r>
+      <w:bookmarkEnd w:id="3"/>
+    </w:p>
+    <w:p>
+      <w:r>
+        <w:t>Dentre as principais atribuições da ANAC, destacam-se:</w:t>
+      </w:r>
+    </w:p>
+    <w:p>
+      <w:r>
+        <w:t>A) Certificação Técnica: Processo sistematizado de avaliação que atesta o cumprimento dos requisitos de segurança operacional para a homologação de tipos de aeronaves, motores, hélices, componentes, fabricantes aeroespaciais, empresas aéreas (operadores RBAC 121 e 135), centros de treinamento, escolas de aviação civil, aeródromos e Oficinas de Manutenção de Aeronaves (RBAC 145).</w:t>
+      </w:r>
+    </w:p>
+    <w:p>
+      <w:r>
+        <w:t>B) Normatização: Elaboração e atualização dos Regulamentos Brasileiros de Aviação Civil (RBAC), Instruções Suplementares (IS) e Resoluções. A edição de normas é precedida por Análise de Impacto Regulatório (AIR) e consultas públicas transparentes.</w:t>
+      </w:r>
+    </w:p>
+    <w:p>
+      <w:r>
+        <w:t>C) Vigilância Continuada e Fiscalização: Acompanhamento permanente dos padrões de desempenho e aeronavegabilidade de produtos, empresas e profissionais credenciados, com poder para aplicar sanções administrativas, multas, interdições de aeronaves e suspensão de licenças.</w:t>
+      </w:r>
+    </w:p>
+    <w:p>
+      <w:r>
+        <w:t>D) Outorga e Regulação Econômica: Concessão de exploração de serviços aéreos regulares e não regulares, administração do regime tarifário de infraestrutura aeroportuária e mediação de conflitos de interesse (arbitragem administrativa).</w:t>
+      </w:r>
+    </w:p>
     <w:p>
       <w:pPr>
         <w:pStyle w:val="Ttulo1"/>
@@ -953,117 +1284,7 @@
       <w:pPr>
         <w:pStyle w:val="Ttulo1"/>
       </w:pPr>
-      <w:bookmarkStart w:id="2" w:name="_Toc238193055"/>
-      <w:r>
-        <w:lastRenderedPageBreak/>
-        <w:t>3. ATUAÇÃO E COMPETÊNCIAS REGULATÓRIAS DA ANAC</w:t>
-      </w:r>
-      <w:bookmarkEnd w:id="2"/>
-    </w:p>
-    <w:p>
-      <w:r>
-        <w:t xml:space="preserve">A ANAC exerce o papel de autoridade de aviação civil do Estado brasileiro, atuando em conformidade com a Convenção sobre Aviação Civil Internacional (Convenção de Chicago de 1944), da qual o Brasil é membro fundador e signatário. A Agência possui acordos bilaterais de cooperação técnica e reconhecimento mútuo com as principais autoridades aeronáuticas mundiais, como a Federal </w:t>
-      </w:r>
-      <w:proofErr w:type="spellStart"/>
-      <w:r>
-        <w:t>Aviation</w:t>
-      </w:r>
-      <w:proofErr w:type="spellEnd"/>
-      <w:r>
-        <w:t xml:space="preserve"> </w:t>
-      </w:r>
-      <w:proofErr w:type="spellStart"/>
-      <w:r>
-        <w:t>Administration</w:t>
-      </w:r>
-      <w:proofErr w:type="spellEnd"/>
-      <w:r>
-        <w:t xml:space="preserve"> (FAA) dos Estados Unidos e a </w:t>
-      </w:r>
-      <w:proofErr w:type="spellStart"/>
-      <w:r>
-        <w:t>European</w:t>
-      </w:r>
-      <w:proofErr w:type="spellEnd"/>
-      <w:r>
-        <w:t xml:space="preserve"> Union </w:t>
-      </w:r>
-      <w:proofErr w:type="spellStart"/>
-      <w:r>
-        <w:t>Aviation</w:t>
-      </w:r>
-      <w:proofErr w:type="spellEnd"/>
-      <w:r>
-        <w:t xml:space="preserve"> </w:t>
-      </w:r>
-      <w:proofErr w:type="spellStart"/>
-      <w:r>
-        <w:t>Safety</w:t>
-      </w:r>
-      <w:proofErr w:type="spellEnd"/>
-      <w:r>
-        <w:t xml:space="preserve"> </w:t>
-      </w:r>
-      <w:proofErr w:type="spellStart"/>
-      <w:r>
-        <w:t>Agency</w:t>
-      </w:r>
-      <w:proofErr w:type="spellEnd"/>
-      <w:r>
-        <w:t xml:space="preserve"> (EASA) da União Europeia.</w:t>
-      </w:r>
-    </w:p>
-    <w:p>
-      <w:pPr>
-        <w:pStyle w:val="Ttulo2"/>
-      </w:pPr>
-      <w:bookmarkStart w:id="3" w:name="_Toc238193056"/>
-      <w:r>
-        <w:t>3.1. Principais atribuições</w:t>
-      </w:r>
-      <w:bookmarkEnd w:id="3"/>
-    </w:p>
-    <w:p>
-      <w:r>
-        <w:t>Dentre as principais atribuições da ANAC, destacam-se:</w:t>
-      </w:r>
-    </w:p>
-    <w:p>
-      <w:r>
-        <w:t>A) Certificação Técnica: Processo sistematizado de avaliação que atesta o cumprimento dos requisitos de segurança operacional para a homologação de tipos de aeronaves, motores, hélices, componentes, fabricantes aeroespaciais, empresas aéreas (operadores RBAC 121 e 135), centros de treinamento, escolas de aviação civil, aeródromos e Oficinas de Manutenção de Aeronaves (RBAC 145).</w:t>
-      </w:r>
-    </w:p>
-    <w:p>
-      <w:r>
-        <w:t>B) Normatização: Elaboração e atualização dos Regulamentos Brasileiros de Aviação Civil (RBAC), Instruções Suplementares (IS) e Resoluções. A edição de normas é precedida por Análise de Impacto Regulatório (AIR) e consultas públicas transparentes.</w:t>
-      </w:r>
-    </w:p>
-    <w:p>
-      <w:r>
-        <w:t>C) Vigilância Continuada e Fiscalização: Acompanhamento permanente dos padrões de desempenho e aeronavegabilidade de produtos, empresas e profissionais credenciados, com poder para aplicar sanções administrativas, multas, interdições de aeronaves e suspensão de licenças.</w:t>
-      </w:r>
-    </w:p>
-    <w:p>
-      <w:r>
-        <w:t>D) Outorga e Regulação Econômica: Concessão de exploração de serviços aéreos regulares e não regulares, administração do regime tarifário de infraestrutura aeroportuária e mediação de conflitos de interesse (arbitragem administrativa).</w:t>
-      </w:r>
-    </w:p>
-    <w:p>
-      <w:pPr>
-        <w:pStyle w:val="Ttulo1"/>
-        <w:sectPr>
-          <w:pgSz w:w="11906" w:h="16838"/>
-          <w:pgMar w:top="1701" w:right="1134" w:bottom="1134" w:left="1701" w:header="709" w:footer="709" w:gutter="0"/>
-          <w:cols w:space="708"/>
-          <w:docGrid w:linePitch="360"/>
-        </w:sectPr>
-      </w:pPr>
-    </w:p>
-    <w:p>
-      <w:pPr>
-        <w:pStyle w:val="Ttulo1"/>
-      </w:pPr>
-      <w:bookmarkStart w:id="4" w:name="_Toc238193057"/>
+      <w:bookmarkStart w:id="4" w:name="_Toc238763190"/>
       <w:r>
         <w:lastRenderedPageBreak/>
         <w:t>4. CLASSIFICAÇÃO DAS AERONAVES E ESPECIFICAÇÕES TÉCNICAS</w:t>
@@ -2835,8 +3056,62 @@
     </w:tbl>
     <w:p/>
     <w:p>
-      <w:r>
-        <w:t xml:space="preserve">[INSERIR FIGURA AQUI: INSERIR UMA IMAGEM DA AERONAVE EMBRAER E195-E2 OU SANTOS DUMONT 14-BIS E APLICAR A LEGENDA AUTOMÁTICA 'Figura 1: Aeronave comercial moderna com materiais compostos e motores </w:t>
+      <w:pPr>
+        <w:ind w:firstLine="0"/>
+      </w:pPr>
+      <w:r>
+        <w:rPr>
+          <w:noProof/>
+        </w:rPr>
+        <w:drawing>
+          <wp:inline distT="0" distB="0" distL="0" distR="0" wp14:anchorId="305FA005" wp14:editId="7E7DDCA7">
+            <wp:extent cx="5760085" cy="3841750"/>
+            <wp:effectExtent l="0" t="0" r="0" b="6350"/>
+            <wp:docPr id="1346829117" name="Embraer-E195-E2-Profit-Hunter-1024x683.jpg"/>
+            <wp:cNvGraphicFramePr>
+              <a:graphicFrameLocks xmlns:a="http://schemas.openxmlformats.org/drawingml/2006/main" noChangeAspect="1"/>
+            </wp:cNvGraphicFramePr>
+            <a:graphic xmlns:a="http://schemas.openxmlformats.org/drawingml/2006/main">
+              <a:graphicData uri="http://schemas.openxmlformats.org/drawingml/2006/picture">
+                <pic:pic xmlns:pic="http://schemas.openxmlformats.org/drawingml/2006/picture">
+                  <pic:nvPicPr>
+                    <pic:cNvPr id="1346829117" name="Embraer-E195-E2-Profit-Hunter-1024x683.jpg"/>
+                    <pic:cNvPicPr/>
+                  </pic:nvPicPr>
+                  <pic:blipFill>
+                    <a:blip r:embed="rId9" r:link="rId10">
+                      <a:extLst>
+                        <a:ext uri="{28A0092B-C50C-407E-A947-70E740481C1C}">
+                          <a14:useLocalDpi xmlns:a14="http://schemas.microsoft.com/office/drawing/2010/main" val="0"/>
+                        </a:ext>
+                      </a:extLst>
+                    </a:blip>
+                    <a:stretch>
+                      <a:fillRect/>
+                    </a:stretch>
+                  </pic:blipFill>
+                  <pic:spPr>
+                    <a:xfrm>
+                      <a:off x="0" y="0"/>
+                      <a:ext cx="5760085" cy="3841750"/>
+                    </a:xfrm>
+                    <a:prstGeom prst="rect">
+                      <a:avLst/>
+                    </a:prstGeom>
+                  </pic:spPr>
+                </pic:pic>
+              </a:graphicData>
+            </a:graphic>
+          </wp:inline>
+        </w:drawing>
+      </w:r>
+    </w:p>
+    <w:p>
+      <w:pPr>
+        <w:ind w:firstLine="0"/>
+      </w:pPr>
+      <w:r>
+        <w:t xml:space="preserve">Figura 1: Aeronave comercial moderna com materiais compostos e motores </w:t>
       </w:r>
       <w:proofErr w:type="spellStart"/>
       <w:r>
@@ -2851,9 +3126,6 @@
         <w:t>Turbofan</w:t>
       </w:r>
       <w:proofErr w:type="spellEnd"/>
-      <w:r>
-        <w:t>']</w:t>
-      </w:r>
     </w:p>
     <w:p/>
     <w:p>
@@ -2871,7 +3143,7 @@
       <w:pPr>
         <w:pStyle w:val="Ttulo1"/>
       </w:pPr>
-      <w:bookmarkStart w:id="5" w:name="_Toc238193058"/>
+      <w:bookmarkStart w:id="5" w:name="_Toc238763191"/>
       <w:r>
         <w:lastRenderedPageBreak/>
         <w:t>5. CERTIFICAÇÃO DE PILOTOS, LICENÇAS E HABILITAÇÕES</w:t>
@@ -2944,7 +3216,7 @@
       <w:pPr>
         <w:pStyle w:val="Ttulo1"/>
       </w:pPr>
-      <w:bookmarkStart w:id="6" w:name="_Toc238193059"/>
+      <w:bookmarkStart w:id="6" w:name="_Toc238763192"/>
       <w:r>
         <w:lastRenderedPageBreak/>
         <w:t>6. A INDÚSTRIA AERONÁUTICA BRASILEIRA E A EMBRAER</w:t>
@@ -2985,7 +3257,7 @@
       <w:pPr>
         <w:pStyle w:val="Ttulo1"/>
       </w:pPr>
-      <w:bookmarkStart w:id="7" w:name="_Toc238193060"/>
+      <w:bookmarkStart w:id="7" w:name="_Toc238763193"/>
       <w:r>
         <w:lastRenderedPageBreak/>
         <w:t>7. CONSIDERAÇÕES FINAIS E REFERÊNCIAS BIBLIOGRÁFICAS</w:t>
@@ -3013,7 +3285,7 @@
       <w:pPr>
         <w:pStyle w:val="Ttulo1"/>
       </w:pPr>
-      <w:bookmarkStart w:id="8" w:name="_Toc238193061"/>
+      <w:bookmarkStart w:id="8" w:name="_Toc238763194"/>
       <w:r>
         <w:lastRenderedPageBreak/>
         <w:t>REFERÊNCIAS BIBLIOGRÁFICAS E NORMATIVAS</w:t>
@@ -3061,6 +3333,114 @@
     </w:sectPr>
   </w:body>
 </w:document>
+</file>
+
+<file path=word/endnotes.xml><?xml version="1.0" encoding="utf-8"?>
+<w:endnotes xmlns:wpc="http://schemas.microsoft.com/office/word/2010/wordprocessingCanvas" xmlns:cx="http://schemas.microsoft.com/office/drawing/2014/chartex" xmlns:cx1="http://schemas.microsoft.com/office/drawing/2015/9/8/chartex" xmlns:cx2="http://schemas.microsoft.com/office/drawing/2015/10/21/chartex" xmlns:cx3="http://schemas.microsoft.com/office/drawing/2016/5/9/chartex" xmlns:cx4="http://schemas.microsoft.com/office/drawing/2016/5/10/chartex" xmlns:cx5="http://schemas.microsoft.com/office/drawing/2016/5/11/chartex" xmlns:cx6="http://schemas.microsoft.com/office/drawing/2016/5/12/chartex" xmlns:cx7="http://schemas.microsoft.com/office/drawing/2016/5/13/chartex" xmlns:cx8="http://schemas.microsoft.com/office/drawing/2016/5/14/chartex" xmlns:mc="http://schemas.openxmlformats.org/markup-compatibility/2006" xmlns:aink="http://schemas.microsoft.com/office/drawing/2016/ink" xmlns:am3d="http://schemas.microsoft.com/office/drawing/2017/model3d" xmlns:o="urn:schemas-microsoft-com:office:office" xmlns:oel="http://schemas.microsoft.com/office/2019/extlst" xmlns:r="http://schemas.openxmlformats.org/officeDocument/2006/relationships" xmlns:m="http://schemas.openxmlformats.org/officeDocument/2006/math" xmlns:v="urn:schemas-microsoft-com:vml" xmlns:wp14="http://schemas.microsoft.com/office/word/2010/wordprocessingDrawing" xmlns:wp="http://schemas.openxmlformats.org/drawingml/2006/wordprocessingDrawing" xmlns:w10="urn:schemas-microsoft-com:office:word" xmlns:w="http://schemas.openxmlformats.org/wordprocessingml/2006/main" xmlns:w14="http://schemas.microsoft.com/office/word/2010/wordml" xmlns:w15="http://schemas.microsoft.com/office/word/2012/wordml" xmlns:w16cex="http://schemas.microsoft.com/office/word/2018/wordml/cex" xmlns:w16cid="http://schemas.microsoft.com/office/word/2016/wordml/cid" xmlns:w16="http://schemas.microsoft.com/office/word/2018/wordml" xmlns:w16du="http://schemas.microsoft.com/office/word/2023/wordml/word16du" xmlns:w16sdtdh="http://schemas.microsoft.com/office/word/2020/wordml/sdtdatahash" xmlns:w16sdtfl="http://schemas.microsoft.com/office/word/2024/wordml/sdtformatlock" xmlns:w16se="http://schemas.microsoft.com/office/word/2015/wordml/symex" xmlns:wpg="http://schemas.microsoft.com/office/word/2010/wordprocessingGroup" xmlns:wpi="http://schemas.microsoft.com/office/word/2010/wordprocessingInk" xmlns:wne="http://schemas.microsoft.com/office/word/2006/wordml" xmlns:wps="http://schemas.microsoft.com/office/word/2010/wordprocessingShape" mc:Ignorable="w14 w15 w16se w16cid w16 w16cex w16sdtdh w16sdtfl w16du wp14">
+  <w:endnote w:type="separator" w:id="-1">
+    <w:p>
+      <w:pPr>
+        <w:spacing w:after="0" w:line="240" w:lineRule="auto"/>
+      </w:pPr>
+      <w:r>
+        <w:separator/>
+      </w:r>
+    </w:p>
+  </w:endnote>
+  <w:endnote w:type="continuationSeparator" w:id="0">
+    <w:p>
+      <w:pPr>
+        <w:spacing w:after="0" w:line="240" w:lineRule="auto"/>
+      </w:pPr>
+      <w:r>
+        <w:continuationSeparator/>
+      </w:r>
+    </w:p>
+  </w:endnote>
+</w:endnotes>
+</file>
+
+<file path=word/footnotes.xml><?xml version="1.0" encoding="utf-8"?>
+<w:footnotes xmlns:wpc="http://schemas.microsoft.com/office/word/2010/wordprocessingCanvas" xmlns:cx="http://schemas.microsoft.com/office/drawing/2014/chartex" xmlns:cx1="http://schemas.microsoft.com/office/drawing/2015/9/8/chartex" xmlns:cx2="http://schemas.microsoft.com/office/drawing/2015/10/21/chartex" xmlns:cx3="http://schemas.microsoft.com/office/drawing/2016/5/9/chartex" xmlns:cx4="http://schemas.microsoft.com/office/drawing/2016/5/10/chartex" xmlns:cx5="http://schemas.microsoft.com/office/drawing/2016/5/11/chartex" xmlns:cx6="http://schemas.microsoft.com/office/drawing/2016/5/12/chartex" xmlns:cx7="http://schemas.microsoft.com/office/drawing/2016/5/13/chartex" xmlns:cx8="http://schemas.microsoft.com/office/drawing/2016/5/14/chartex" xmlns:mc="http://schemas.openxmlformats.org/markup-compatibility/2006" xmlns:aink="http://schemas.microsoft.com/office/drawing/2016/ink" xmlns:am3d="http://schemas.microsoft.com/office/drawing/2017/model3d" xmlns:o="urn:schemas-microsoft-com:office:office" xmlns:oel="http://schemas.microsoft.com/office/2019/extlst" xmlns:r="http://schemas.openxmlformats.org/officeDocument/2006/relationships" xmlns:m="http://schemas.openxmlformats.org/officeDocument/2006/math" xmlns:v="urn:schemas-microsoft-com:vml" xmlns:wp14="http://schemas.microsoft.com/office/word/2010/wordprocessingDrawing" xmlns:wp="http://schemas.openxmlformats.org/drawingml/2006/wordprocessingDrawing" xmlns:w10="urn:schemas-microsoft-com:office:word" xmlns:w="http://schemas.openxmlformats.org/wordprocessingml/2006/main" xmlns:w14="http://schemas.microsoft.com/office/word/2010/wordml" xmlns:w15="http://schemas.microsoft.com/office/word/2012/wordml" xmlns:w16cex="http://schemas.microsoft.com/office/word/2018/wordml/cex" xmlns:w16cid="http://schemas.microsoft.com/office/word/2016/wordml/cid" xmlns:w16="http://schemas.microsoft.com/office/word/2018/wordml" xmlns:w16du="http://schemas.microsoft.com/office/word/2023/wordml/word16du" xmlns:w16sdtdh="http://schemas.microsoft.com/office/word/2020/wordml/sdtdatahash" xmlns:w16sdtfl="http://schemas.microsoft.com/office/word/2024/wordml/sdtformatlock" xmlns:w16se="http://schemas.microsoft.com/office/word/2015/wordml/symex" xmlns:wpg="http://schemas.microsoft.com/office/word/2010/wordprocessingGroup" xmlns:wpi="http://schemas.microsoft.com/office/word/2010/wordprocessingInk" xmlns:wne="http://schemas.microsoft.com/office/word/2006/wordml" xmlns:wps="http://schemas.microsoft.com/office/word/2010/wordprocessingShape" mc:Ignorable="w14 w15 w16se w16cid w16 w16cex w16sdtdh w16sdtfl w16du wp14">
+  <w:footnote w:type="separator" w:id="-1">
+    <w:p>
+      <w:pPr>
+        <w:spacing w:after="0" w:line="240" w:lineRule="auto"/>
+      </w:pPr>
+      <w:r>
+        <w:separator/>
+      </w:r>
+    </w:p>
+  </w:footnote>
+  <w:footnote w:type="continuationSeparator" w:id="0">
+    <w:p>
+      <w:pPr>
+        <w:spacing w:after="0" w:line="240" w:lineRule="auto"/>
+      </w:pPr>
+      <w:r>
+        <w:continuationSeparator/>
+      </w:r>
+    </w:p>
+  </w:footnote>
+</w:footnotes>
+</file>
+
+<file path=word/header1.xml><?xml version="1.0" encoding="utf-8"?>
+<w:hdr xmlns:wpc="http://schemas.microsoft.com/office/word/2010/wordprocessingCanvas" xmlns:cx="http://schemas.microsoft.com/office/drawing/2014/chartex" xmlns:cx1="http://schemas.microsoft.com/office/drawing/2015/9/8/chartex" xmlns:cx2="http://schemas.microsoft.com/office/drawing/2015/10/21/chartex" xmlns:cx3="http://schemas.microsoft.com/office/drawing/2016/5/9/chartex" xmlns:cx4="http://schemas.microsoft.com/office/drawing/2016/5/10/chartex" xmlns:cx5="http://schemas.microsoft.com/office/drawing/2016/5/11/chartex" xmlns:cx6="http://schemas.microsoft.com/office/drawing/2016/5/12/chartex" xmlns:cx7="http://schemas.microsoft.com/office/drawing/2016/5/13/chartex" xmlns:cx8="http://schemas.microsoft.com/office/drawing/2016/5/14/chartex" xmlns:mc="http://schemas.openxmlformats.org/markup-compatibility/2006" xmlns:aink="http://schemas.microsoft.com/office/drawing/2016/ink" xmlns:am3d="http://schemas.microsoft.com/office/drawing/2017/model3d" xmlns:o="urn:schemas-microsoft-com:office:office" xmlns:oel="http://schemas.microsoft.com/office/2019/extlst" xmlns:r="http://schemas.openxmlformats.org/officeDocument/2006/relationships" xmlns:m="http://schemas.openxmlformats.org/officeDocument/2006/math" xmlns:v="urn:schemas-microsoft-com:vml" xmlns:wp14="http://schemas.microsoft.com/office/word/2010/wordprocessingDrawing" xmlns:wp="http://schemas.openxmlformats.org/drawingml/2006/wordprocessingDrawing" xmlns:w10="urn:schemas-microsoft-com:office:word" xmlns:w="http://schemas.openxmlformats.org/wordprocessingml/2006/main" xmlns:w14="http://schemas.microsoft.com/office/word/2010/wordml" xmlns:w15="http://schemas.microsoft.com/office/word/2012/wordml" xmlns:w16cex="http://schemas.microsoft.com/office/word/2018/wordml/cex" xmlns:w16cid="http://schemas.microsoft.com/office/word/2016/wordml/cid" xmlns:w16="http://schemas.microsoft.com/office/word/2018/wordml" xmlns:w16du="http://schemas.microsoft.com/office/word/2023/wordml/word16du" xmlns:w16sdtdh="http://schemas.microsoft.com/office/word/2020/wordml/sdtdatahash" xmlns:w16sdtfl="http://schemas.microsoft.com/office/word/2024/wordml/sdtformatlock" xmlns:w16se="http://schemas.microsoft.com/office/word/2015/wordml/symex" xmlns:wpg="http://schemas.microsoft.com/office/word/2010/wordprocessingGroup" xmlns:wpi="http://schemas.microsoft.com/office/word/2010/wordprocessingInk" xmlns:wne="http://schemas.microsoft.com/office/word/2006/wordml" xmlns:wps="http://schemas.microsoft.com/office/word/2010/wordprocessingShape" mc:Ignorable="w14 w15 w16se w16cid w16 w16cex w16sdtdh w16sdtfl w16du wp14">
+  <w:p>
+    <w:pPr>
+      <w:pStyle w:val="Cabealho"/>
+      <w:jc w:val="right"/>
+    </w:pPr>
+  </w:p>
+  <w:p>
+    <w:pPr>
+      <w:pStyle w:val="Cabealho"/>
+    </w:pPr>
+  </w:p>
+</w:hdr>
+</file>
+
+<file path=word/header2.xml><?xml version="1.0" encoding="utf-8"?>
+<w:hdr xmlns:wpc="http://schemas.microsoft.com/office/word/2010/wordprocessingCanvas" xmlns:cx="http://schemas.microsoft.com/office/drawing/2014/chartex" xmlns:cx1="http://schemas.microsoft.com/office/drawing/2015/9/8/chartex" xmlns:cx2="http://schemas.microsoft.com/office/drawing/2015/10/21/chartex" xmlns:cx3="http://schemas.microsoft.com/office/drawing/2016/5/9/chartex" xmlns:cx4="http://schemas.microsoft.com/office/drawing/2016/5/10/chartex" xmlns:cx5="http://schemas.microsoft.com/office/drawing/2016/5/11/chartex" xmlns:cx6="http://schemas.microsoft.com/office/drawing/2016/5/12/chartex" xmlns:cx7="http://schemas.microsoft.com/office/drawing/2016/5/13/chartex" xmlns:cx8="http://schemas.microsoft.com/office/drawing/2016/5/14/chartex" xmlns:mc="http://schemas.openxmlformats.org/markup-compatibility/2006" xmlns:aink="http://schemas.microsoft.com/office/drawing/2016/ink" xmlns:am3d="http://schemas.microsoft.com/office/drawing/2017/model3d" xmlns:o="urn:schemas-microsoft-com:office:office" xmlns:oel="http://schemas.microsoft.com/office/2019/extlst" xmlns:r="http://schemas.openxmlformats.org/officeDocument/2006/relationships" xmlns:m="http://schemas.openxmlformats.org/officeDocument/2006/math" xmlns:v="urn:schemas-microsoft-com:vml" xmlns:wp14="http://schemas.microsoft.com/office/word/2010/wordprocessingDrawing" xmlns:wp="http://schemas.openxmlformats.org/drawingml/2006/wordprocessingDrawing" xmlns:w10="urn:schemas-microsoft-com:office:word" xmlns:w="http://schemas.openxmlformats.org/wordprocessingml/2006/main" xmlns:w14="http://schemas.microsoft.com/office/word/2010/wordml" xmlns:w15="http://schemas.microsoft.com/office/word/2012/wordml" xmlns:w16cex="http://schemas.microsoft.com/office/word/2018/wordml/cex" xmlns:w16cid="http://schemas.microsoft.com/office/word/2016/wordml/cid" xmlns:w16="http://schemas.microsoft.com/office/word/2018/wordml" xmlns:w16du="http://schemas.microsoft.com/office/word/2023/wordml/word16du" xmlns:w16sdtdh="http://schemas.microsoft.com/office/word/2020/wordml/sdtdatahash" xmlns:w16sdtfl="http://schemas.microsoft.com/office/word/2024/wordml/sdtformatlock" xmlns:w16se="http://schemas.microsoft.com/office/word/2015/wordml/symex" xmlns:wpg="http://schemas.microsoft.com/office/word/2010/wordprocessingGroup" xmlns:wpi="http://schemas.microsoft.com/office/word/2010/wordprocessingInk" xmlns:wne="http://schemas.microsoft.com/office/word/2006/wordml" xmlns:wps="http://schemas.microsoft.com/office/word/2010/wordprocessingShape" mc:Ignorable="w14 w15 w16se w16cid w16 w16cex w16sdtdh w16sdtfl w16du wp14">
+  <w:sdt>
+    <w:sdtPr>
+      <w:id w:val="-1612576668"/>
+      <w:docPartObj>
+        <w:docPartGallery w:val="Page Numbers (Top of Page)"/>
+        <w:docPartUnique/>
+      </w:docPartObj>
+    </w:sdtPr>
+    <w:sdtContent>
+      <w:p>
+        <w:pPr>
+          <w:pStyle w:val="Cabealho"/>
+          <w:jc w:val="right"/>
+        </w:pPr>
+        <w:r>
+          <w:fldChar w:fldCharType="begin"/>
+        </w:r>
+        <w:r>
+          <w:instrText>PAGE   \* MERGEFORMAT</w:instrText>
+        </w:r>
+        <w:r>
+          <w:fldChar w:fldCharType="separate"/>
+        </w:r>
+        <w:r>
+          <w:t>2</w:t>
+        </w:r>
+        <w:r>
+          <w:fldChar w:fldCharType="end"/>
+        </w:r>
+      </w:p>
+    </w:sdtContent>
+  </w:sdt>
+  <w:p>
+    <w:pPr>
+      <w:pStyle w:val="Cabealho"/>
+    </w:pPr>
+  </w:p>
+</w:hdr>
 </file>
 
 <file path=word/styles.xml><?xml version="1.0" encoding="utf-8"?>
@@ -4248,6 +4628,56 @@
       </w:tcPr>
     </w:tblStylePr>
   </w:style>
+  <w:style w:type="paragraph" w:styleId="Cabealho">
+    <w:name w:val="header"/>
+    <w:basedOn w:val="Normal"/>
+    <w:link w:val="CabealhoChar"/>
+    <w:uiPriority w:val="99"/>
+    <w:unhideWhenUsed/>
+    <w:rsid w:val="00162999"/>
+    <w:pPr>
+      <w:tabs>
+        <w:tab w:val="center" w:pos="4252"/>
+        <w:tab w:val="right" w:pos="8504"/>
+      </w:tabs>
+      <w:spacing w:after="0" w:line="240" w:lineRule="auto"/>
+    </w:pPr>
+  </w:style>
+  <w:style w:type="character" w:customStyle="1" w:styleId="CabealhoChar">
+    <w:name w:val="Cabeçalho Char"/>
+    <w:basedOn w:val="Fontepargpadro"/>
+    <w:link w:val="Cabealho"/>
+    <w:uiPriority w:val="99"/>
+    <w:rsid w:val="00162999"/>
+    <w:rPr>
+      <w:rFonts w:ascii="Arial" w:hAnsi="Arial"/>
+    </w:rPr>
+  </w:style>
+  <w:style w:type="paragraph" w:styleId="Rodap">
+    <w:name w:val="footer"/>
+    <w:basedOn w:val="Normal"/>
+    <w:link w:val="RodapChar"/>
+    <w:uiPriority w:val="99"/>
+    <w:unhideWhenUsed/>
+    <w:rsid w:val="00162999"/>
+    <w:pPr>
+      <w:tabs>
+        <w:tab w:val="center" w:pos="4252"/>
+        <w:tab w:val="right" w:pos="8504"/>
+      </w:tabs>
+      <w:spacing w:after="0" w:line="240" w:lineRule="auto"/>
+    </w:pPr>
+  </w:style>
+  <w:style w:type="character" w:customStyle="1" w:styleId="RodapChar">
+    <w:name w:val="Rodapé Char"/>
+    <w:basedOn w:val="Fontepargpadro"/>
+    <w:link w:val="Rodap"/>
+    <w:uiPriority w:val="99"/>
+    <w:rsid w:val="00162999"/>
+    <w:rPr>
+      <w:rFonts w:ascii="Arial" w:hAnsi="Arial"/>
+    </w:rPr>
+  </w:style>
 </w:styles>
 </file>
 

</xml_diff>